<commit_message>
2023-03-21 End of day file push
</commit_message>
<xml_diff>
--- a/Sales/New Pace Models/Breakdown.docx
+++ b/Sales/New Pace Models/Breakdown.docx
@@ -82,33 +82,33 @@
               <w:jc w:val="center"/>
             </w:pPr>
             <w:r>
-              <w:t>77968</w:t>
-            </w:r>
-          </w:p>
-        </w:tc>
-        <w:tc>
-          <w:tcPr>
-            <w:tcW w:w="3192" w:type="dxa"/>
-          </w:tcPr>
-          <w:p>
-            <w:pPr>
-              <w:jc w:val="center"/>
-            </w:pPr>
-            <w:r>
-              <w:t>ED4X Detroit T</w:t>
-            </w:r>
-          </w:p>
-        </w:tc>
-        <w:tc>
-          <w:tcPr>
-            <w:tcW w:w="3192" w:type="dxa"/>
-          </w:tcPr>
-          <w:p>
-            <w:pPr>
-              <w:jc w:val="center"/>
-            </w:pPr>
-            <w:r>
-              <w:t>SG101115</w:t>
+              <w:t>77969</w:t>
+            </w:r>
+          </w:p>
+        </w:tc>
+        <w:tc>
+          <w:tcPr>
+            <w:tcW w:w="3192" w:type="dxa"/>
+          </w:tcPr>
+          <w:p>
+            <w:pPr>
+              <w:jc w:val="center"/>
+            </w:pPr>
+            <w:r>
+              <w:t>End Dump 4X</w:t>
+            </w:r>
+          </w:p>
+        </w:tc>
+        <w:tc>
+          <w:tcPr>
+            <w:tcW w:w="3192" w:type="dxa"/>
+          </w:tcPr>
+          <w:p>
+            <w:pPr>
+              <w:jc w:val="center"/>
+            </w:pPr>
+            <w:r>
+              <w:t>SG101116</w:t>
             </w:r>
           </w:p>
         </w:tc>
@@ -123,33 +123,33 @@
               <w:jc w:val="center"/>
             </w:pPr>
             <w:r>
-              <w:t>79612</w:t>
-            </w:r>
-          </w:p>
-        </w:tc>
-        <w:tc>
-          <w:tcPr>
-            <w:tcW w:w="3192" w:type="dxa"/>
-          </w:tcPr>
-          <w:p>
-            <w:pPr>
-              <w:jc w:val="center"/>
-            </w:pPr>
-            <w:r>
-              <w:t>BTL3X</w:t>
-            </w:r>
-          </w:p>
-        </w:tc>
-        <w:tc>
-          <w:tcPr>
-            <w:tcW w:w="3192" w:type="dxa"/>
-          </w:tcPr>
-          <w:p>
-            <w:pPr>
-              <w:jc w:val="center"/>
-            </w:pPr>
-            <w:r>
-              <w:t>SG101122</w:t>
+              <w:t>77968</w:t>
+            </w:r>
+          </w:p>
+        </w:tc>
+        <w:tc>
+          <w:tcPr>
+            <w:tcW w:w="3192" w:type="dxa"/>
+          </w:tcPr>
+          <w:p>
+            <w:pPr>
+              <w:jc w:val="center"/>
+            </w:pPr>
+            <w:r>
+              <w:t>ED4X Detroit T</w:t>
+            </w:r>
+          </w:p>
+        </w:tc>
+        <w:tc>
+          <w:tcPr>
+            <w:tcW w:w="3192" w:type="dxa"/>
+          </w:tcPr>
+          <w:p>
+            <w:pPr>
+              <w:jc w:val="center"/>
+            </w:pPr>
+            <w:r>
+              <w:t>SG101115</w:t>
             </w:r>
           </w:p>
         </w:tc>
@@ -164,33 +164,33 @@
               <w:jc w:val="center"/>
             </w:pPr>
             <w:r>
-              <w:t>79613</w:t>
-            </w:r>
-          </w:p>
-        </w:tc>
-        <w:tc>
-          <w:tcPr>
-            <w:tcW w:w="3192" w:type="dxa"/>
-          </w:tcPr>
-          <w:p>
-            <w:pPr>
-              <w:jc w:val="center"/>
-            </w:pPr>
-            <w:r>
-              <w:t>BTL3X+2X</w:t>
-            </w:r>
-          </w:p>
-        </w:tc>
-        <w:tc>
-          <w:tcPr>
-            <w:tcW w:w="3192" w:type="dxa"/>
-          </w:tcPr>
-          <w:p>
-            <w:pPr>
-              <w:jc w:val="center"/>
-            </w:pPr>
-            <w:r>
-              <w:t>SG101123</w:t>
+              <w:t>79612</w:t>
+            </w:r>
+          </w:p>
+        </w:tc>
+        <w:tc>
+          <w:tcPr>
+            <w:tcW w:w="3192" w:type="dxa"/>
+          </w:tcPr>
+          <w:p>
+            <w:pPr>
+              <w:jc w:val="center"/>
+            </w:pPr>
+            <w:r>
+              <w:t>BTL3X</w:t>
+            </w:r>
+          </w:p>
+        </w:tc>
+        <w:tc>
+          <w:tcPr>
+            <w:tcW w:w="3192" w:type="dxa"/>
+          </w:tcPr>
+          <w:p>
+            <w:pPr>
+              <w:jc w:val="center"/>
+            </w:pPr>
+            <w:r>
+              <w:t>SG101122</w:t>
             </w:r>
           </w:p>
         </w:tc>
@@ -205,33 +205,33 @@
               <w:jc w:val="center"/>
             </w:pPr>
             <w:r>
-              <w:t>79490</w:t>
-            </w:r>
-          </w:p>
-        </w:tc>
-        <w:tc>
-          <w:tcPr>
-            <w:tcW w:w="3192" w:type="dxa"/>
-          </w:tcPr>
-          <w:p>
-            <w:pPr>
-              <w:jc w:val="center"/>
-            </w:pPr>
-            <w:r>
-              <w:t>BTL3X</w:t>
-            </w:r>
-          </w:p>
-        </w:tc>
-        <w:tc>
-          <w:tcPr>
-            <w:tcW w:w="3192" w:type="dxa"/>
-          </w:tcPr>
-          <w:p>
-            <w:pPr>
-              <w:jc w:val="center"/>
-            </w:pPr>
-            <w:r>
-              <w:t>SG101125</w:t>
+              <w:t>79613</w:t>
+            </w:r>
+          </w:p>
+        </w:tc>
+        <w:tc>
+          <w:tcPr>
+            <w:tcW w:w="3192" w:type="dxa"/>
+          </w:tcPr>
+          <w:p>
+            <w:pPr>
+              <w:jc w:val="center"/>
+            </w:pPr>
+            <w:r>
+              <w:t>BTL3X+2X</w:t>
+            </w:r>
+          </w:p>
+        </w:tc>
+        <w:tc>
+          <w:tcPr>
+            <w:tcW w:w="3192" w:type="dxa"/>
+          </w:tcPr>
+          <w:p>
+            <w:pPr>
+              <w:jc w:val="center"/>
+            </w:pPr>
+            <w:r>
+              <w:t>SG101123</w:t>
             </w:r>
           </w:p>
         </w:tc>
@@ -246,33 +246,33 @@
               <w:jc w:val="center"/>
             </w:pPr>
             <w:r>
-              <w:t>79500</w:t>
-            </w:r>
-          </w:p>
-        </w:tc>
-        <w:tc>
-          <w:tcPr>
-            <w:tcW w:w="3192" w:type="dxa"/>
-          </w:tcPr>
-          <w:p>
-            <w:pPr>
-              <w:jc w:val="center"/>
-            </w:pPr>
-            <w:r>
-              <w:t>BTL3X+2X</w:t>
-            </w:r>
-          </w:p>
-        </w:tc>
-        <w:tc>
-          <w:tcPr>
-            <w:tcW w:w="3192" w:type="dxa"/>
-          </w:tcPr>
-          <w:p>
-            <w:pPr>
-              <w:jc w:val="center"/>
-            </w:pPr>
-            <w:r>
-              <w:t>SG101126</w:t>
+              <w:t>79490</w:t>
+            </w:r>
+          </w:p>
+        </w:tc>
+        <w:tc>
+          <w:tcPr>
+            <w:tcW w:w="3192" w:type="dxa"/>
+          </w:tcPr>
+          <w:p>
+            <w:pPr>
+              <w:jc w:val="center"/>
+            </w:pPr>
+            <w:r>
+              <w:t>BTL3X</w:t>
+            </w:r>
+          </w:p>
+        </w:tc>
+        <w:tc>
+          <w:tcPr>
+            <w:tcW w:w="3192" w:type="dxa"/>
+          </w:tcPr>
+          <w:p>
+            <w:pPr>
+              <w:jc w:val="center"/>
+            </w:pPr>
+            <w:r>
+              <w:t>SG101125</w:t>
             </w:r>
           </w:p>
         </w:tc>
@@ -286,58 +286,120 @@
             <w:pPr>
               <w:jc w:val="center"/>
             </w:pPr>
-          </w:p>
-        </w:tc>
-        <w:tc>
-          <w:tcPr>
-            <w:tcW w:w="3192" w:type="dxa"/>
-          </w:tcPr>
-          <w:p>
-            <w:pPr>
-              <w:jc w:val="center"/>
-            </w:pPr>
-          </w:p>
-        </w:tc>
-        <w:tc>
-          <w:tcPr>
-            <w:tcW w:w="3192" w:type="dxa"/>
-          </w:tcPr>
-          <w:p>
-            <w:pPr>
-              <w:jc w:val="center"/>
-            </w:pPr>
+            <w:r>
+              <w:t>79500</w:t>
+            </w:r>
+          </w:p>
+        </w:tc>
+        <w:tc>
+          <w:tcPr>
+            <w:tcW w:w="3192" w:type="dxa"/>
+          </w:tcPr>
+          <w:p>
+            <w:pPr>
+              <w:jc w:val="center"/>
+            </w:pPr>
+            <w:r>
+              <w:t>BTL3X+2X</w:t>
+            </w:r>
+          </w:p>
+        </w:tc>
+        <w:tc>
+          <w:tcPr>
+            <w:tcW w:w="3192" w:type="dxa"/>
+          </w:tcPr>
+          <w:p>
+            <w:pPr>
+              <w:jc w:val="center"/>
+            </w:pPr>
+            <w:r>
+              <w:t>SG101126</w:t>
+            </w:r>
           </w:p>
         </w:tc>
       </w:tr>
       <w:tr>
-        <w:tc>
-          <w:tcPr>
-            <w:tcW w:w="3192" w:type="dxa"/>
-          </w:tcPr>
-          <w:p>
-            <w:pPr>
-              <w:jc w:val="center"/>
-            </w:pPr>
-          </w:p>
-        </w:tc>
-        <w:tc>
-          <w:tcPr>
-            <w:tcW w:w="3192" w:type="dxa"/>
-          </w:tcPr>
-          <w:p>
-            <w:pPr>
-              <w:jc w:val="center"/>
-            </w:pPr>
-          </w:p>
-        </w:tc>
-        <w:tc>
-          <w:tcPr>
-            <w:tcW w:w="3192" w:type="dxa"/>
-          </w:tcPr>
-          <w:p>
-            <w:pPr>
-              <w:jc w:val="center"/>
-            </w:pPr>
+        <w:trPr>
+          <w:trHeight w:val="116"/>
+        </w:trPr>
+        <w:tc>
+          <w:tcPr>
+            <w:tcW w:w="3192" w:type="dxa"/>
+          </w:tcPr>
+          <w:p>
+            <w:pPr>
+              <w:jc w:val="center"/>
+            </w:pPr>
+            <w:r>
+              <w:t>80299</w:t>
+            </w:r>
+          </w:p>
+        </w:tc>
+        <w:tc>
+          <w:tcPr>
+            <w:tcW w:w="3192" w:type="dxa"/>
+          </w:tcPr>
+          <w:p>
+            <w:pPr>
+              <w:jc w:val="center"/>
+            </w:pPr>
+            <w:r>
+              <w:t>BTL3X</w:t>
+            </w:r>
+          </w:p>
+        </w:tc>
+        <w:tc>
+          <w:tcPr>
+            <w:tcW w:w="3192" w:type="dxa"/>
+          </w:tcPr>
+          <w:p>
+            <w:pPr>
+              <w:jc w:val="center"/>
+            </w:pPr>
+            <w:r>
+              <w:t>SG101127</w:t>
+            </w:r>
+          </w:p>
+        </w:tc>
+      </w:tr>
+      <w:tr>
+        <w:tc>
+          <w:tcPr>
+            <w:tcW w:w="3192" w:type="dxa"/>
+          </w:tcPr>
+          <w:p>
+            <w:pPr>
+              <w:jc w:val="center"/>
+            </w:pPr>
+            <w:r>
+              <w:t>80300</w:t>
+            </w:r>
+          </w:p>
+        </w:tc>
+        <w:tc>
+          <w:tcPr>
+            <w:tcW w:w="3192" w:type="dxa"/>
+          </w:tcPr>
+          <w:p>
+            <w:pPr>
+              <w:jc w:val="center"/>
+            </w:pPr>
+            <w:r>
+              <w:t>BTL3X+2X</w:t>
+            </w:r>
+          </w:p>
+        </w:tc>
+        <w:tc>
+          <w:tcPr>
+            <w:tcW w:w="3192" w:type="dxa"/>
+          </w:tcPr>
+          <w:p>
+            <w:pPr>
+              <w:jc w:val="center"/>
+            </w:pPr>
+            <w:r>
+              <w:t>SG101128</w:t>
+            </w:r>
           </w:p>
         </w:tc>
       </w:tr>
@@ -905,7 +967,7 @@
   <a:extraClrSchemeLst/>
   <a:extLst>
     <a:ext uri="{05A4C25C-085E-4340-85A3-A5531E510DB2}">
-      <thm15:themeFamily xmlns="" xmlns:thm15="http://schemas.microsoft.com/office/thememl/2012/main" name="Office Theme" id="{62F939B6-93AF-4DB8-9C6B-D6C7DFDC589F}" vid="{4A3C46E8-61CC-4603-A589-7422A47A8E4A}"/>
+      <thm15:themeFamily xmlns:thm15="http://schemas.microsoft.com/office/thememl/2012/main" xmlns="" name="Office Theme" id="{62F939B6-93AF-4DB8-9C6B-D6C7DFDC589F}" vid="{4A3C46E8-61CC-4603-A589-7422A47A8E4A}"/>
     </a:ext>
   </a:extLst>
 </a:theme>

</xml_diff>

<commit_message>
2023-03-22 End of day file push
</commit_message>
<xml_diff>
--- a/Sales/New Pace Models/Breakdown.docx
+++ b/Sales/New Pace Models/Breakdown.docx
@@ -136,7 +136,10 @@
               <w:jc w:val="center"/>
             </w:pPr>
             <w:r>
-              <w:t>ED4X Detroit T</w:t>
+              <w:t>E</w:t>
+            </w:r>
+            <w:r>
+              <w:t>nd Dump 4X</w:t>
             </w:r>
           </w:p>
         </w:tc>
@@ -158,6 +161,7 @@
         <w:tc>
           <w:tcPr>
             <w:tcW w:w="3192" w:type="dxa"/>
+            <w:shd w:val="clear" w:color="auto" w:fill="F7CAAC" w:themeFill="accent2" w:themeFillTint="66"/>
           </w:tcPr>
           <w:p>
             <w:pPr>
@@ -171,6 +175,7 @@
         <w:tc>
           <w:tcPr>
             <w:tcW w:w="3192" w:type="dxa"/>
+            <w:shd w:val="clear" w:color="auto" w:fill="F7CAAC" w:themeFill="accent2" w:themeFillTint="66"/>
           </w:tcPr>
           <w:p>
             <w:pPr>
@@ -184,6 +189,7 @@
         <w:tc>
           <w:tcPr>
             <w:tcW w:w="3192" w:type="dxa"/>
+            <w:shd w:val="clear" w:color="auto" w:fill="F7CAAC" w:themeFill="accent2" w:themeFillTint="66"/>
           </w:tcPr>
           <w:p>
             <w:pPr>
@@ -199,6 +205,7 @@
         <w:tc>
           <w:tcPr>
             <w:tcW w:w="3192" w:type="dxa"/>
+            <w:shd w:val="clear" w:color="auto" w:fill="F7CAAC" w:themeFill="accent2" w:themeFillTint="66"/>
           </w:tcPr>
           <w:p>
             <w:pPr>
@@ -212,6 +219,7 @@
         <w:tc>
           <w:tcPr>
             <w:tcW w:w="3192" w:type="dxa"/>
+            <w:shd w:val="clear" w:color="auto" w:fill="F7CAAC" w:themeFill="accent2" w:themeFillTint="66"/>
           </w:tcPr>
           <w:p>
             <w:pPr>
@@ -225,6 +233,7 @@
         <w:tc>
           <w:tcPr>
             <w:tcW w:w="3192" w:type="dxa"/>
+            <w:shd w:val="clear" w:color="auto" w:fill="F7CAAC" w:themeFill="accent2" w:themeFillTint="66"/>
           </w:tcPr>
           <w:p>
             <w:pPr>
@@ -240,6 +249,7 @@
         <w:tc>
           <w:tcPr>
             <w:tcW w:w="3192" w:type="dxa"/>
+            <w:shd w:val="clear" w:color="auto" w:fill="9CC2E5" w:themeFill="accent5" w:themeFillTint="99"/>
           </w:tcPr>
           <w:p>
             <w:pPr>
@@ -253,6 +263,7 @@
         <w:tc>
           <w:tcPr>
             <w:tcW w:w="3192" w:type="dxa"/>
+            <w:shd w:val="clear" w:color="auto" w:fill="9CC2E5" w:themeFill="accent5" w:themeFillTint="99"/>
           </w:tcPr>
           <w:p>
             <w:pPr>
@@ -266,6 +277,7 @@
         <w:tc>
           <w:tcPr>
             <w:tcW w:w="3192" w:type="dxa"/>
+            <w:shd w:val="clear" w:color="auto" w:fill="9CC2E5" w:themeFill="accent5" w:themeFillTint="99"/>
           </w:tcPr>
           <w:p>
             <w:pPr>
@@ -281,6 +293,7 @@
         <w:tc>
           <w:tcPr>
             <w:tcW w:w="3192" w:type="dxa"/>
+            <w:shd w:val="clear" w:color="auto" w:fill="9CC2E5" w:themeFill="accent5" w:themeFillTint="99"/>
           </w:tcPr>
           <w:p>
             <w:pPr>
@@ -294,6 +307,7 @@
         <w:tc>
           <w:tcPr>
             <w:tcW w:w="3192" w:type="dxa"/>
+            <w:shd w:val="clear" w:color="auto" w:fill="9CC2E5" w:themeFill="accent5" w:themeFillTint="99"/>
           </w:tcPr>
           <w:p>
             <w:pPr>
@@ -307,6 +321,7 @@
         <w:tc>
           <w:tcPr>
             <w:tcW w:w="3192" w:type="dxa"/>
+            <w:shd w:val="clear" w:color="auto" w:fill="9CC2E5" w:themeFill="accent5" w:themeFillTint="99"/>
           </w:tcPr>
           <w:p>
             <w:pPr>
@@ -325,6 +340,7 @@
         <w:tc>
           <w:tcPr>
             <w:tcW w:w="3192" w:type="dxa"/>
+            <w:shd w:val="clear" w:color="auto" w:fill="F7CAAC" w:themeFill="accent2" w:themeFillTint="66"/>
           </w:tcPr>
           <w:p>
             <w:pPr>
@@ -338,6 +354,7 @@
         <w:tc>
           <w:tcPr>
             <w:tcW w:w="3192" w:type="dxa"/>
+            <w:shd w:val="clear" w:color="auto" w:fill="F7CAAC" w:themeFill="accent2" w:themeFillTint="66"/>
           </w:tcPr>
           <w:p>
             <w:pPr>
@@ -351,6 +368,7 @@
         <w:tc>
           <w:tcPr>
             <w:tcW w:w="3192" w:type="dxa"/>
+            <w:shd w:val="clear" w:color="auto" w:fill="F7CAAC" w:themeFill="accent2" w:themeFillTint="66"/>
           </w:tcPr>
           <w:p>
             <w:pPr>
@@ -366,6 +384,7 @@
         <w:tc>
           <w:tcPr>
             <w:tcW w:w="3192" w:type="dxa"/>
+            <w:shd w:val="clear" w:color="auto" w:fill="F7CAAC" w:themeFill="accent2" w:themeFillTint="66"/>
           </w:tcPr>
           <w:p>
             <w:pPr>
@@ -379,6 +398,7 @@
         <w:tc>
           <w:tcPr>
             <w:tcW w:w="3192" w:type="dxa"/>
+            <w:shd w:val="clear" w:color="auto" w:fill="F7CAAC" w:themeFill="accent2" w:themeFillTint="66"/>
           </w:tcPr>
           <w:p>
             <w:pPr>
@@ -392,6 +412,7 @@
         <w:tc>
           <w:tcPr>
             <w:tcW w:w="3192" w:type="dxa"/>
+            <w:shd w:val="clear" w:color="auto" w:fill="F7CAAC" w:themeFill="accent2" w:themeFillTint="66"/>
           </w:tcPr>
           <w:p>
             <w:pPr>
@@ -399,6 +420,364 @@
             </w:pPr>
             <w:r>
               <w:t>SG101128</w:t>
+            </w:r>
+          </w:p>
+        </w:tc>
+      </w:tr>
+      <w:tr>
+        <w:tc>
+          <w:tcPr>
+            <w:tcW w:w="3192" w:type="dxa"/>
+            <w:shd w:val="clear" w:color="auto" w:fill="9CC2E5" w:themeFill="accent5" w:themeFillTint="99"/>
+          </w:tcPr>
+          <w:p>
+            <w:pPr>
+              <w:jc w:val="center"/>
+            </w:pPr>
+            <w:r>
+              <w:t>79242</w:t>
+            </w:r>
+          </w:p>
+        </w:tc>
+        <w:tc>
+          <w:tcPr>
+            <w:tcW w:w="3192" w:type="dxa"/>
+            <w:shd w:val="clear" w:color="auto" w:fill="9CC2E5" w:themeFill="accent5" w:themeFillTint="99"/>
+          </w:tcPr>
+          <w:p>
+            <w:pPr>
+              <w:jc w:val="center"/>
+            </w:pPr>
+            <w:r>
+              <w:t>BTL3</w:t>
+            </w:r>
+            <w:r>
+              <w:t>X</w:t>
+            </w:r>
+          </w:p>
+        </w:tc>
+        <w:tc>
+          <w:tcPr>
+            <w:tcW w:w="3192" w:type="dxa"/>
+            <w:shd w:val="clear" w:color="auto" w:fill="9CC2E5" w:themeFill="accent5" w:themeFillTint="99"/>
+          </w:tcPr>
+          <w:p>
+            <w:pPr>
+              <w:jc w:val="center"/>
+            </w:pPr>
+            <w:r>
+              <w:t>SG101133</w:t>
+            </w:r>
+          </w:p>
+        </w:tc>
+      </w:tr>
+      <w:tr>
+        <w:tc>
+          <w:tcPr>
+            <w:tcW w:w="3192" w:type="dxa"/>
+            <w:shd w:val="clear" w:color="auto" w:fill="9CC2E5" w:themeFill="accent5" w:themeFillTint="99"/>
+          </w:tcPr>
+          <w:p>
+            <w:pPr>
+              <w:jc w:val="center"/>
+            </w:pPr>
+            <w:r>
+              <w:t>79243</w:t>
+            </w:r>
+          </w:p>
+        </w:tc>
+        <w:tc>
+          <w:tcPr>
+            <w:tcW w:w="3192" w:type="dxa"/>
+            <w:shd w:val="clear" w:color="auto" w:fill="9CC2E5" w:themeFill="accent5" w:themeFillTint="99"/>
+          </w:tcPr>
+          <w:p>
+            <w:pPr>
+              <w:jc w:val="center"/>
+            </w:pPr>
+            <w:r>
+              <w:t>BTL</w:t>
+            </w:r>
+            <w:r>
+              <w:t>2X+2X</w:t>
+            </w:r>
+          </w:p>
+        </w:tc>
+        <w:tc>
+          <w:tcPr>
+            <w:tcW w:w="3192" w:type="dxa"/>
+            <w:shd w:val="clear" w:color="auto" w:fill="9CC2E5" w:themeFill="accent5" w:themeFillTint="99"/>
+          </w:tcPr>
+          <w:p>
+            <w:pPr>
+              <w:jc w:val="center"/>
+            </w:pPr>
+            <w:r>
+              <w:t>SG101134</w:t>
+            </w:r>
+          </w:p>
+        </w:tc>
+      </w:tr>
+      <w:tr>
+        <w:tc>
+          <w:tcPr>
+            <w:tcW w:w="3192" w:type="dxa"/>
+            <w:shd w:val="clear" w:color="auto" w:fill="F7CAAC" w:themeFill="accent2" w:themeFillTint="66"/>
+          </w:tcPr>
+          <w:p>
+            <w:pPr>
+              <w:jc w:val="center"/>
+            </w:pPr>
+            <w:r>
+              <w:t>73720</w:t>
+            </w:r>
+          </w:p>
+        </w:tc>
+        <w:tc>
+          <w:tcPr>
+            <w:tcW w:w="3192" w:type="dxa"/>
+            <w:shd w:val="clear" w:color="auto" w:fill="F7CAAC" w:themeFill="accent2" w:themeFillTint="66"/>
+          </w:tcPr>
+          <w:p>
+            <w:pPr>
+              <w:jc w:val="center"/>
+            </w:pPr>
+            <w:r>
+              <w:t>BTL3X</w:t>
+            </w:r>
+          </w:p>
+        </w:tc>
+        <w:tc>
+          <w:tcPr>
+            <w:tcW w:w="3192" w:type="dxa"/>
+            <w:shd w:val="clear" w:color="auto" w:fill="F7CAAC" w:themeFill="accent2" w:themeFillTint="66"/>
+          </w:tcPr>
+          <w:p>
+            <w:pPr>
+              <w:jc w:val="center"/>
+            </w:pPr>
+            <w:r>
+              <w:t>SG101129</w:t>
+            </w:r>
+          </w:p>
+        </w:tc>
+      </w:tr>
+      <w:tr>
+        <w:tc>
+          <w:tcPr>
+            <w:tcW w:w="3192" w:type="dxa"/>
+            <w:shd w:val="clear" w:color="auto" w:fill="F7CAAC" w:themeFill="accent2" w:themeFillTint="66"/>
+          </w:tcPr>
+          <w:p>
+            <w:pPr>
+              <w:jc w:val="center"/>
+            </w:pPr>
+            <w:r>
+              <w:t>73721</w:t>
+            </w:r>
+          </w:p>
+        </w:tc>
+        <w:tc>
+          <w:tcPr>
+            <w:tcW w:w="3192" w:type="dxa"/>
+            <w:shd w:val="clear" w:color="auto" w:fill="F7CAAC" w:themeFill="accent2" w:themeFillTint="66"/>
+          </w:tcPr>
+          <w:p>
+            <w:pPr>
+              <w:jc w:val="center"/>
+            </w:pPr>
+            <w:r>
+              <w:t>CD2X</w:t>
+            </w:r>
+          </w:p>
+        </w:tc>
+        <w:tc>
+          <w:tcPr>
+            <w:tcW w:w="3192" w:type="dxa"/>
+            <w:shd w:val="clear" w:color="auto" w:fill="F7CAAC" w:themeFill="accent2" w:themeFillTint="66"/>
+          </w:tcPr>
+          <w:p>
+            <w:pPr>
+              <w:jc w:val="center"/>
+            </w:pPr>
+            <w:r>
+              <w:t>28804</w:t>
+            </w:r>
+          </w:p>
+        </w:tc>
+      </w:tr>
+      <w:tr>
+        <w:tc>
+          <w:tcPr>
+            <w:tcW w:w="3192" w:type="dxa"/>
+            <w:shd w:val="clear" w:color="auto" w:fill="F7CAAC" w:themeFill="accent2" w:themeFillTint="66"/>
+          </w:tcPr>
+          <w:p>
+            <w:pPr>
+              <w:jc w:val="center"/>
+            </w:pPr>
+            <w:r>
+              <w:t>73727</w:t>
+            </w:r>
+          </w:p>
+        </w:tc>
+        <w:tc>
+          <w:tcPr>
+            <w:tcW w:w="3192" w:type="dxa"/>
+            <w:shd w:val="clear" w:color="auto" w:fill="F7CAAC" w:themeFill="accent2" w:themeFillTint="66"/>
+          </w:tcPr>
+          <w:p>
+            <w:pPr>
+              <w:jc w:val="center"/>
+            </w:pPr>
+            <w:r>
+              <w:t>BTL3X</w:t>
+            </w:r>
+          </w:p>
+        </w:tc>
+        <w:tc>
+          <w:tcPr>
+            <w:tcW w:w="3192" w:type="dxa"/>
+            <w:shd w:val="clear" w:color="auto" w:fill="F7CAAC" w:themeFill="accent2" w:themeFillTint="66"/>
+          </w:tcPr>
+          <w:p>
+            <w:pPr>
+              <w:jc w:val="center"/>
+            </w:pPr>
+            <w:r>
+              <w:t>SG101130</w:t>
+            </w:r>
+          </w:p>
+        </w:tc>
+      </w:tr>
+      <w:tr>
+        <w:tc>
+          <w:tcPr>
+            <w:tcW w:w="3192" w:type="dxa"/>
+            <w:shd w:val="clear" w:color="auto" w:fill="9CC2E5" w:themeFill="accent5" w:themeFillTint="99"/>
+          </w:tcPr>
+          <w:p>
+            <w:pPr>
+              <w:jc w:val="center"/>
+            </w:pPr>
+            <w:r>
+              <w:t>79245</w:t>
+            </w:r>
+          </w:p>
+        </w:tc>
+        <w:tc>
+          <w:tcPr>
+            <w:tcW w:w="3192" w:type="dxa"/>
+            <w:shd w:val="clear" w:color="auto" w:fill="9CC2E5" w:themeFill="accent5" w:themeFillTint="99"/>
+          </w:tcPr>
+          <w:p>
+            <w:pPr>
+              <w:jc w:val="center"/>
+            </w:pPr>
+            <w:r>
+              <w:t>BTL3X</w:t>
+            </w:r>
+          </w:p>
+        </w:tc>
+        <w:tc>
+          <w:tcPr>
+            <w:tcW w:w="3192" w:type="dxa"/>
+            <w:shd w:val="clear" w:color="auto" w:fill="9CC2E5" w:themeFill="accent5" w:themeFillTint="99"/>
+          </w:tcPr>
+          <w:p>
+            <w:pPr>
+              <w:jc w:val="center"/>
+            </w:pPr>
+            <w:r>
+              <w:t>SG101131</w:t>
+            </w:r>
+          </w:p>
+        </w:tc>
+      </w:tr>
+      <w:tr>
+        <w:tc>
+          <w:tcPr>
+            <w:tcW w:w="3192" w:type="dxa"/>
+            <w:shd w:val="clear" w:color="auto" w:fill="9CC2E5" w:themeFill="accent5" w:themeFillTint="99"/>
+          </w:tcPr>
+          <w:p>
+            <w:pPr>
+              <w:jc w:val="center"/>
+            </w:pPr>
+            <w:r>
+              <w:t>79249</w:t>
+            </w:r>
+          </w:p>
+        </w:tc>
+        <w:tc>
+          <w:tcPr>
+            <w:tcW w:w="3192" w:type="dxa"/>
+            <w:shd w:val="clear" w:color="auto" w:fill="9CC2E5" w:themeFill="accent5" w:themeFillTint="99"/>
+          </w:tcPr>
+          <w:p>
+            <w:pPr>
+              <w:jc w:val="center"/>
+            </w:pPr>
+            <w:r>
+              <w:t>CD2X</w:t>
+            </w:r>
+          </w:p>
+        </w:tc>
+        <w:tc>
+          <w:tcPr>
+            <w:tcW w:w="3192" w:type="dxa"/>
+            <w:shd w:val="clear" w:color="auto" w:fill="9CC2E5" w:themeFill="accent5" w:themeFillTint="99"/>
+          </w:tcPr>
+          <w:p>
+            <w:pPr>
+              <w:jc w:val="center"/>
+            </w:pPr>
+            <w:r>
+              <w:t>28805</w:t>
+            </w:r>
+          </w:p>
+        </w:tc>
+      </w:tr>
+      <w:tr>
+        <w:tc>
+          <w:tcPr>
+            <w:tcW w:w="3192" w:type="dxa"/>
+            <w:shd w:val="clear" w:color="auto" w:fill="9CC2E5" w:themeFill="accent5" w:themeFillTint="99"/>
+          </w:tcPr>
+          <w:p>
+            <w:pPr>
+              <w:jc w:val="center"/>
+            </w:pPr>
+            <w:r>
+              <w:t>79247</w:t>
+            </w:r>
+          </w:p>
+        </w:tc>
+        <w:tc>
+          <w:tcPr>
+            <w:tcW w:w="3192" w:type="dxa"/>
+            <w:shd w:val="clear" w:color="auto" w:fill="9CC2E5" w:themeFill="accent5" w:themeFillTint="99"/>
+          </w:tcPr>
+          <w:p>
+            <w:pPr>
+              <w:jc w:val="center"/>
+            </w:pPr>
+            <w:r>
+              <w:t>BTL3X</w:t>
+            </w:r>
+          </w:p>
+        </w:tc>
+        <w:tc>
+          <w:tcPr>
+            <w:tcW w:w="3192" w:type="dxa"/>
+            <w:shd w:val="clear" w:color="auto" w:fill="9CC2E5" w:themeFill="accent5" w:themeFillTint="99"/>
+          </w:tcPr>
+          <w:p>
+            <w:pPr>
+              <w:jc w:val="center"/>
+            </w:pPr>
+            <w:r>
+              <w:t>SG101132</w:t>
             </w:r>
           </w:p>
         </w:tc>
@@ -967,7 +1346,7 @@
   <a:extraClrSchemeLst/>
   <a:extLst>
     <a:ext uri="{05A4C25C-085E-4340-85A3-A5531E510DB2}">
-      <thm15:themeFamily xmlns:thm15="http://schemas.microsoft.com/office/thememl/2012/main" xmlns="" name="Office Theme" id="{62F939B6-93AF-4DB8-9C6B-D6C7DFDC589F}" vid="{4A3C46E8-61CC-4603-A589-7422A47A8E4A}"/>
+      <thm15:themeFamily xmlns="" xmlns:thm15="http://schemas.microsoft.com/office/thememl/2012/main" name="Office Theme" id="{62F939B6-93AF-4DB8-9C6B-D6C7DFDC589F}" vid="{4A3C46E8-61CC-4603-A589-7422A47A8E4A}"/>
     </a:ext>
   </a:extLst>
 </a:theme>

</xml_diff>

<commit_message>
2023-03-23 End of day file push
</commit_message>
<xml_diff>
--- a/Sales/New Pace Models/Breakdown.docx
+++ b/Sales/New Pace Models/Breakdown.docx
@@ -17,6 +17,7 @@
         <w:tc>
           <w:tcPr>
             <w:tcW w:w="3192" w:type="dxa"/>
+            <w:shd w:val="clear" w:color="auto" w:fill="3B3838" w:themeFill="background2" w:themeFillShade="40"/>
           </w:tcPr>
           <w:p>
             <w:pPr>
@@ -36,6 +37,7 @@
         <w:tc>
           <w:tcPr>
             <w:tcW w:w="3192" w:type="dxa"/>
+            <w:shd w:val="clear" w:color="auto" w:fill="3B3838" w:themeFill="background2" w:themeFillShade="40"/>
           </w:tcPr>
           <w:p>
             <w:pPr>
@@ -55,6 +57,7 @@
         <w:tc>
           <w:tcPr>
             <w:tcW w:w="3192" w:type="dxa"/>
+            <w:shd w:val="clear" w:color="auto" w:fill="3B3838" w:themeFill="background2" w:themeFillShade="40"/>
           </w:tcPr>
           <w:p>
             <w:pPr>
@@ -76,6 +79,7 @@
         <w:tc>
           <w:tcPr>
             <w:tcW w:w="3192" w:type="dxa"/>
+            <w:shd w:val="clear" w:color="auto" w:fill="F7CAAC" w:themeFill="accent2" w:themeFillTint="66"/>
           </w:tcPr>
           <w:p>
             <w:pPr>
@@ -89,6 +93,7 @@
         <w:tc>
           <w:tcPr>
             <w:tcW w:w="3192" w:type="dxa"/>
+            <w:shd w:val="clear" w:color="auto" w:fill="F7CAAC" w:themeFill="accent2" w:themeFillTint="66"/>
           </w:tcPr>
           <w:p>
             <w:pPr>
@@ -102,6 +107,7 @@
         <w:tc>
           <w:tcPr>
             <w:tcW w:w="3192" w:type="dxa"/>
+            <w:shd w:val="clear" w:color="auto" w:fill="F7CAAC" w:themeFill="accent2" w:themeFillTint="66"/>
           </w:tcPr>
           <w:p>
             <w:pPr>
@@ -117,6 +123,7 @@
         <w:tc>
           <w:tcPr>
             <w:tcW w:w="3192" w:type="dxa"/>
+            <w:shd w:val="clear" w:color="auto" w:fill="9CC2E5" w:themeFill="accent5" w:themeFillTint="99"/>
           </w:tcPr>
           <w:p>
             <w:pPr>
@@ -130,6 +137,7 @@
         <w:tc>
           <w:tcPr>
             <w:tcW w:w="3192" w:type="dxa"/>
+            <w:shd w:val="clear" w:color="auto" w:fill="9CC2E5" w:themeFill="accent5" w:themeFillTint="99"/>
           </w:tcPr>
           <w:p>
             <w:pPr>
@@ -146,6 +154,7 @@
         <w:tc>
           <w:tcPr>
             <w:tcW w:w="3192" w:type="dxa"/>
+            <w:shd w:val="clear" w:color="auto" w:fill="9CC2E5" w:themeFill="accent5" w:themeFillTint="99"/>
           </w:tcPr>
           <w:p>
             <w:pPr>
@@ -786,31 +795,87 @@
         <w:tc>
           <w:tcPr>
             <w:tcW w:w="3192" w:type="dxa"/>
-          </w:tcPr>
-          <w:p>
-            <w:pPr>
-              <w:jc w:val="center"/>
-            </w:pPr>
-          </w:p>
-        </w:tc>
-        <w:tc>
-          <w:tcPr>
-            <w:tcW w:w="3192" w:type="dxa"/>
-          </w:tcPr>
-          <w:p>
-            <w:pPr>
-              <w:jc w:val="center"/>
-            </w:pPr>
-          </w:p>
-        </w:tc>
-        <w:tc>
-          <w:tcPr>
-            <w:tcW w:w="3192" w:type="dxa"/>
-          </w:tcPr>
-          <w:p>
-            <w:pPr>
-              <w:jc w:val="center"/>
-            </w:pPr>
+            <w:shd w:val="clear" w:color="auto" w:fill="F7CAAC" w:themeFill="accent2" w:themeFillTint="66"/>
+          </w:tcPr>
+          <w:p>
+            <w:pPr>
+              <w:jc w:val="center"/>
+            </w:pPr>
+            <w:r>
+              <w:t>81149</w:t>
+            </w:r>
+          </w:p>
+        </w:tc>
+        <w:tc>
+          <w:tcPr>
+            <w:tcW w:w="3192" w:type="dxa"/>
+            <w:shd w:val="clear" w:color="auto" w:fill="F7CAAC" w:themeFill="accent2" w:themeFillTint="66"/>
+          </w:tcPr>
+          <w:p>
+            <w:pPr>
+              <w:jc w:val="center"/>
+            </w:pPr>
+            <w:r>
+              <w:t>BTL3X</w:t>
+            </w:r>
+          </w:p>
+        </w:tc>
+        <w:tc>
+          <w:tcPr>
+            <w:tcW w:w="3192" w:type="dxa"/>
+            <w:shd w:val="clear" w:color="auto" w:fill="F7CAAC" w:themeFill="accent2" w:themeFillTint="66"/>
+          </w:tcPr>
+          <w:p>
+            <w:pPr>
+              <w:jc w:val="center"/>
+            </w:pPr>
+            <w:r>
+              <w:t>SG101135</w:t>
+            </w:r>
+          </w:p>
+        </w:tc>
+      </w:tr>
+      <w:tr>
+        <w:tc>
+          <w:tcPr>
+            <w:tcW w:w="3192" w:type="dxa"/>
+            <w:shd w:val="clear" w:color="auto" w:fill="F7CAAC" w:themeFill="accent2" w:themeFillTint="66"/>
+          </w:tcPr>
+          <w:p>
+            <w:pPr>
+              <w:jc w:val="center"/>
+            </w:pPr>
+            <w:r>
+              <w:t>81171</w:t>
+            </w:r>
+          </w:p>
+        </w:tc>
+        <w:tc>
+          <w:tcPr>
+            <w:tcW w:w="3192" w:type="dxa"/>
+            <w:shd w:val="clear" w:color="auto" w:fill="F7CAAC" w:themeFill="accent2" w:themeFillTint="66"/>
+          </w:tcPr>
+          <w:p>
+            <w:pPr>
+              <w:jc w:val="center"/>
+            </w:pPr>
+            <w:r>
+              <w:t>BTL3X+2X</w:t>
+            </w:r>
+          </w:p>
+        </w:tc>
+        <w:tc>
+          <w:tcPr>
+            <w:tcW w:w="3192" w:type="dxa"/>
+            <w:shd w:val="clear" w:color="auto" w:fill="F7CAAC" w:themeFill="accent2" w:themeFillTint="66"/>
+          </w:tcPr>
+          <w:p>
+            <w:pPr>
+              <w:jc w:val="center"/>
+            </w:pPr>
+            <w:r>
+              <w:t>SG101136</w:t>
+            </w:r>
           </w:p>
         </w:tc>
       </w:tr>
@@ -1346,7 +1411,7 @@
   <a:extraClrSchemeLst/>
   <a:extLst>
     <a:ext uri="{05A4C25C-085E-4340-85A3-A5531E510DB2}">
-      <thm15:themeFamily xmlns="" xmlns:thm15="http://schemas.microsoft.com/office/thememl/2012/main" name="Office Theme" id="{62F939B6-93AF-4DB8-9C6B-D6C7DFDC589F}" vid="{4A3C46E8-61CC-4603-A589-7422A47A8E4A}"/>
+      <thm15:themeFamily xmlns:thm15="http://schemas.microsoft.com/office/thememl/2012/main" xmlns="" name="Office Theme" id="{62F939B6-93AF-4DB8-9C6B-D6C7DFDC589F}" vid="{4A3C46E8-61CC-4603-A589-7422A47A8E4A}"/>
     </a:ext>
   </a:extLst>
 </a:theme>

</xml_diff>